<commit_message>
Minor start on two documents
</commit_message>
<xml_diff>
--- a/Low Battery Contribution Statement.docx
+++ b/Low Battery Contribution Statement.docx
@@ -10,6 +10,748 @@
           <w:szCs w:val="28"/>
         </w:rPr>
       </w:pPr>
+      <w:r>
+        <w:rPr>
+          <w:rFonts w:ascii="Bahnschrift SemiLight" w:hAnsi="Bahnschrift SemiLight"/>
+          <w:sz w:val="28"/>
+          <w:szCs w:val="28"/>
+        </w:rPr>
+        <w:t>ENGE707</w:t>
+      </w:r>
+      <w:r>
+        <w:rPr>
+          <w:rFonts w:ascii="Bahnschrift SemiLight" w:hAnsi="Bahnschrift SemiLight"/>
+          <w:sz w:val="28"/>
+          <w:szCs w:val="28"/>
+        </w:rPr>
+        <w:tab/>
+        <w:t>Team Low Battery</w:t>
+      </w:r>
+      <w:r>
+        <w:rPr>
+          <w:rFonts w:ascii="Bahnschrift SemiLight" w:hAnsi="Bahnschrift SemiLight"/>
+          <w:sz w:val="28"/>
+          <w:szCs w:val="28"/>
+        </w:rPr>
+        <w:tab/>
+      </w:r>
+      <w:r>
+        <w:rPr>
+          <w:rFonts w:ascii="Bahnschrift SemiLight" w:hAnsi="Bahnschrift SemiLight"/>
+          <w:sz w:val="28"/>
+          <w:szCs w:val="28"/>
+        </w:rPr>
+        <w:t>Telecom Customer Churn Prediction</w:t>
+      </w:r>
+    </w:p>
+    <w:p>
+      <w:pPr>
+        <w:rPr>
+          <w:rFonts w:ascii="Bahnschrift SemiLight" w:hAnsi="Bahnschrift SemiLight"/>
+          <w:sz w:val="28"/>
+          <w:szCs w:val="28"/>
+        </w:rPr>
+      </w:pPr>
+    </w:p>
+    <w:p>
+      <w:pPr>
+        <w:pStyle w:val="ListParagraph"/>
+        <w:numPr>
+          <w:ilvl w:val="0"/>
+          <w:numId w:val="1"/>
+        </w:numPr>
+        <w:rPr>
+          <w:rFonts w:ascii="Bahnschrift SemiLight" w:hAnsi="Bahnschrift SemiLight"/>
+          <w:sz w:val="28"/>
+          <w:szCs w:val="28"/>
+        </w:rPr>
+      </w:pPr>
+      <w:r>
+        <w:rPr>
+          <w:rFonts w:ascii="Bahnschrift SemiLight" w:hAnsi="Bahnschrift SemiLight"/>
+          <w:sz w:val="28"/>
+          <w:szCs w:val="28"/>
+        </w:rPr>
+        <w:t>Team members:</w:t>
+      </w:r>
+    </w:p>
+    <w:p>
+      <w:pPr>
+        <w:rPr>
+          <w:rFonts w:ascii="Bahnschrift SemiLight" w:hAnsi="Bahnschrift SemiLight"/>
+          <w:sz w:val="28"/>
+          <w:szCs w:val="28"/>
+        </w:rPr>
+      </w:pPr>
+      <w:r>
+        <w:rPr>
+          <w:rFonts w:ascii="Bahnschrift SemiLight" w:hAnsi="Bahnschrift SemiLight"/>
+          <w:sz w:val="28"/>
+          <w:szCs w:val="28"/>
+        </w:rPr>
+        <w:t>Erin Sandra Christopher (24222848)</w:t>
+      </w:r>
+    </w:p>
+    <w:p>
+      <w:pPr>
+        <w:rPr>
+          <w:rFonts w:ascii="Bahnschrift SemiLight" w:hAnsi="Bahnschrift SemiLight"/>
+          <w:sz w:val="28"/>
+          <w:szCs w:val="28"/>
+        </w:rPr>
+      </w:pPr>
+      <w:r>
+        <w:rPr>
+          <w:rFonts w:ascii="Bahnschrift SemiLight" w:hAnsi="Bahnschrift SemiLight"/>
+          <w:sz w:val="28"/>
+          <w:szCs w:val="28"/>
+        </w:rPr>
+        <w:t>Huyin Song (25331396)</w:t>
+      </w:r>
+    </w:p>
+    <w:p>
+      <w:pPr>
+        <w:rPr>
+          <w:rFonts w:ascii="Bahnschrift SemiLight" w:hAnsi="Bahnschrift SemiLight"/>
+          <w:sz w:val="28"/>
+          <w:szCs w:val="28"/>
+        </w:rPr>
+      </w:pPr>
+    </w:p>
+    <w:tbl>
+      <w:tblPr>
+        <w:tblStyle w:val="TableGrid"/>
+        <w:tblW w:w="0" w:type="auto"/>
+        <w:tblLook w:val="04A0" w:firstRow="1" w:lastRow="0" w:firstColumn="1" w:lastColumn="0" w:noHBand="0" w:noVBand="1"/>
+      </w:tblPr>
+      <w:tblGrid>
+        <w:gridCol w:w="3005"/>
+        <w:gridCol w:w="3005"/>
+        <w:gridCol w:w="3006"/>
+      </w:tblGrid>
+      <w:tr>
+        <w:tc>
+          <w:tcPr>
+            <w:tcW w:w="3005" w:type="dxa"/>
+            <w:vMerge w:val="restart"/>
+            <w:vAlign w:val="center"/>
+          </w:tcPr>
+          <w:p>
+            <w:pPr>
+              <w:jc w:val="center"/>
+              <w:rPr>
+                <w:rFonts w:ascii="Bahnschrift SemiLight" w:hAnsi="Bahnschrift SemiLight"/>
+                <w:sz w:val="28"/>
+                <w:szCs w:val="28"/>
+              </w:rPr>
+            </w:pPr>
+            <w:r>
+              <w:rPr>
+                <w:b/>
+                <w:bCs/>
+                <w:sz w:val="28"/>
+                <w:szCs w:val="28"/>
+              </w:rPr>
+              <w:t>Task</w:t>
+            </w:r>
+          </w:p>
+        </w:tc>
+        <w:tc>
+          <w:tcPr>
+            <w:tcW w:w="6011" w:type="dxa"/>
+            <w:gridSpan w:val="2"/>
+          </w:tcPr>
+          <w:p>
+            <w:pPr>
+              <w:jc w:val="center"/>
+              <w:rPr>
+                <w:b/>
+                <w:bCs/>
+                <w:sz w:val="28"/>
+                <w:szCs w:val="28"/>
+              </w:rPr>
+            </w:pPr>
+            <w:r>
+              <w:rPr>
+                <w:b/>
+                <w:bCs/>
+                <w:sz w:val="28"/>
+                <w:szCs w:val="28"/>
+              </w:rPr>
+              <w:t>Team Member’s Contributions</w:t>
+            </w:r>
+          </w:p>
+        </w:tc>
+      </w:tr>
+      <w:tr>
+        <w:tc>
+          <w:tcPr>
+            <w:tcW w:w="3005" w:type="dxa"/>
+            <w:vMerge/>
+          </w:tcPr>
+          <w:p>
+            <w:pPr>
+              <w:jc w:val="center"/>
+              <w:rPr>
+                <w:b/>
+                <w:bCs/>
+                <w:sz w:val="28"/>
+                <w:szCs w:val="28"/>
+              </w:rPr>
+            </w:pPr>
+          </w:p>
+        </w:tc>
+        <w:tc>
+          <w:tcPr>
+            <w:tcW w:w="3005" w:type="dxa"/>
+          </w:tcPr>
+          <w:p>
+            <w:pPr>
+              <w:jc w:val="center"/>
+              <w:rPr>
+                <w:rFonts w:ascii="Bahnschrift SemiLight" w:hAnsi="Bahnschrift SemiLight"/>
+                <w:i/>
+                <w:iCs/>
+                <w:sz w:val="28"/>
+                <w:szCs w:val="28"/>
+              </w:rPr>
+            </w:pPr>
+            <w:r>
+              <w:rPr>
+                <w:rFonts w:ascii="Bahnschrift SemiLight" w:hAnsi="Bahnschrift SemiLight"/>
+                <w:i/>
+                <w:iCs/>
+                <w:sz w:val="28"/>
+                <w:szCs w:val="28"/>
+              </w:rPr>
+              <w:t>Huyin</w:t>
+            </w:r>
+          </w:p>
+        </w:tc>
+        <w:tc>
+          <w:tcPr>
+            <w:tcW w:w="3006" w:type="dxa"/>
+          </w:tcPr>
+          <w:p>
+            <w:pPr>
+              <w:jc w:val="center"/>
+              <w:rPr>
+                <w:rFonts w:ascii="Bahnschrift SemiLight" w:hAnsi="Bahnschrift SemiLight"/>
+                <w:i/>
+                <w:iCs/>
+                <w:sz w:val="28"/>
+                <w:szCs w:val="28"/>
+              </w:rPr>
+            </w:pPr>
+            <w:r>
+              <w:rPr>
+                <w:rFonts w:ascii="Bahnschrift SemiLight" w:hAnsi="Bahnschrift SemiLight"/>
+                <w:i/>
+                <w:iCs/>
+                <w:sz w:val="28"/>
+                <w:szCs w:val="28"/>
+              </w:rPr>
+              <w:t>Erin</w:t>
+            </w:r>
+          </w:p>
+        </w:tc>
+      </w:tr>
+      <w:tr>
+        <w:tc>
+          <w:tcPr>
+            <w:tcW w:w="3005" w:type="dxa"/>
+          </w:tcPr>
+          <w:p>
+            <w:pPr>
+              <w:jc w:val="center"/>
+              <w:rPr>
+                <w:rFonts w:ascii="Bahnschrift SemiLight" w:hAnsi="Bahnschrift SemiLight"/>
+                <w:sz w:val="28"/>
+                <w:szCs w:val="28"/>
+              </w:rPr>
+            </w:pPr>
+            <w:r>
+              <w:rPr>
+                <w:rFonts w:ascii="Bahnschrift SemiLight" w:hAnsi="Bahnschrift SemiLight"/>
+                <w:sz w:val="28"/>
+                <w:szCs w:val="28"/>
+              </w:rPr>
+              <w:t xml:space="preserve">Number of commits to </w:t>
+            </w:r>
+            <w:r>
+              <w:rPr>
+                <w:rFonts w:ascii="Bahnschrift SemiLight" w:hAnsi="Bahnschrift SemiLight"/>
+                <w:sz w:val="28"/>
+                <w:szCs w:val="28"/>
+              </w:rPr>
+              <w:t>GitHub</w:t>
+            </w:r>
+          </w:p>
+        </w:tc>
+        <w:tc>
+          <w:tcPr>
+            <w:tcW w:w="3005" w:type="dxa"/>
+          </w:tcPr>
+          <w:p>
+            <w:pPr>
+              <w:jc w:val="center"/>
+              <w:rPr>
+                <w:rFonts w:ascii="Bahnschrift SemiLight" w:hAnsi="Bahnschrift SemiLight"/>
+                <w:sz w:val="28"/>
+                <w:szCs w:val="28"/>
+              </w:rPr>
+            </w:pPr>
+            <w:r>
+              <w:rPr>
+                <w:rFonts w:ascii="Bahnschrift SemiLight" w:hAnsi="Bahnschrift SemiLight"/>
+                <w:sz w:val="28"/>
+                <w:szCs w:val="28"/>
+              </w:rPr>
+              <w:t>15</w:t>
+            </w:r>
+            <w:r>
+              <w:rPr>
+                <w:rFonts w:ascii="Bahnschrift SemiLight" w:hAnsi="Bahnschrift SemiLight"/>
+                <w:sz w:val="28"/>
+                <w:szCs w:val="28"/>
+              </w:rPr>
+              <w:t xml:space="preserve"> (78.9%)</w:t>
+            </w:r>
+            <w:r>
+              <w:rPr>
+                <w:rFonts w:ascii="Bahnschrift SemiLight" w:hAnsi="Bahnschrift SemiLight"/>
+                <w:sz w:val="28"/>
+                <w:szCs w:val="28"/>
+              </w:rPr>
+              <w:t>*</w:t>
+            </w:r>
+          </w:p>
+        </w:tc>
+        <w:tc>
+          <w:tcPr>
+            <w:tcW w:w="3006" w:type="dxa"/>
+          </w:tcPr>
+          <w:p>
+            <w:pPr>
+              <w:jc w:val="center"/>
+              <w:rPr>
+                <w:rFonts w:ascii="Bahnschrift SemiLight" w:hAnsi="Bahnschrift SemiLight"/>
+                <w:sz w:val="28"/>
+                <w:szCs w:val="28"/>
+              </w:rPr>
+            </w:pPr>
+            <w:r>
+              <w:rPr>
+                <w:rFonts w:ascii="Bahnschrift SemiLight" w:hAnsi="Bahnschrift SemiLight"/>
+                <w:sz w:val="28"/>
+                <w:szCs w:val="28"/>
+              </w:rPr>
+              <w:t>4</w:t>
+            </w:r>
+            <w:r>
+              <w:rPr>
+                <w:rFonts w:ascii="Bahnschrift SemiLight" w:hAnsi="Bahnschrift SemiLight"/>
+                <w:sz w:val="28"/>
+                <w:szCs w:val="28"/>
+              </w:rPr>
+              <w:t xml:space="preserve"> (21.1%)</w:t>
+            </w:r>
+            <w:r>
+              <w:rPr>
+                <w:rFonts w:ascii="Bahnschrift SemiLight" w:hAnsi="Bahnschrift SemiLight"/>
+                <w:sz w:val="28"/>
+                <w:szCs w:val="28"/>
+              </w:rPr>
+              <w:t>*</w:t>
+            </w:r>
+          </w:p>
+        </w:tc>
+      </w:tr>
+      <w:tr>
+        <w:tc>
+          <w:tcPr>
+            <w:tcW w:w="3005" w:type="dxa"/>
+          </w:tcPr>
+          <w:p>
+            <w:pPr>
+              <w:jc w:val="center"/>
+              <w:rPr>
+                <w:rFonts w:ascii="Bahnschrift SemiLight" w:hAnsi="Bahnschrift SemiLight"/>
+                <w:sz w:val="28"/>
+                <w:szCs w:val="28"/>
+              </w:rPr>
+            </w:pPr>
+            <w:r>
+              <w:rPr>
+                <w:rFonts w:ascii="Bahnschrift SemiLight" w:hAnsi="Bahnschrift SemiLight"/>
+                <w:sz w:val="28"/>
+                <w:szCs w:val="28"/>
+              </w:rPr>
+              <w:t>Number of additions to GitHub</w:t>
+            </w:r>
+          </w:p>
+        </w:tc>
+        <w:tc>
+          <w:tcPr>
+            <w:tcW w:w="3005" w:type="dxa"/>
+          </w:tcPr>
+          <w:p>
+            <w:pPr>
+              <w:jc w:val="center"/>
+              <w:rPr>
+                <w:rFonts w:ascii="Bahnschrift SemiLight" w:hAnsi="Bahnschrift SemiLight"/>
+                <w:sz w:val="28"/>
+                <w:szCs w:val="28"/>
+              </w:rPr>
+            </w:pPr>
+          </w:p>
+        </w:tc>
+        <w:tc>
+          <w:tcPr>
+            <w:tcW w:w="3006" w:type="dxa"/>
+          </w:tcPr>
+          <w:p>
+            <w:pPr>
+              <w:jc w:val="center"/>
+              <w:rPr>
+                <w:rFonts w:ascii="Bahnschrift SemiLight" w:hAnsi="Bahnschrift SemiLight"/>
+                <w:sz w:val="28"/>
+                <w:szCs w:val="28"/>
+              </w:rPr>
+            </w:pPr>
+          </w:p>
+        </w:tc>
+      </w:tr>
+      <w:tr>
+        <w:tc>
+          <w:tcPr>
+            <w:tcW w:w="3005" w:type="dxa"/>
+          </w:tcPr>
+          <w:p>
+            <w:pPr>
+              <w:jc w:val="center"/>
+              <w:rPr>
+                <w:rFonts w:ascii="Bahnschrift SemiLight" w:hAnsi="Bahnschrift SemiLight"/>
+                <w:sz w:val="28"/>
+                <w:szCs w:val="28"/>
+              </w:rPr>
+            </w:pPr>
+            <w:r>
+              <w:rPr>
+                <w:rFonts w:ascii="Bahnschrift SemiLight" w:hAnsi="Bahnschrift SemiLight"/>
+                <w:sz w:val="28"/>
+                <w:szCs w:val="28"/>
+              </w:rPr>
+              <w:t xml:space="preserve">Number of Deletions to </w:t>
+            </w:r>
+            <w:r>
+              <w:rPr>
+                <w:rFonts w:ascii="Bahnschrift SemiLight" w:hAnsi="Bahnschrift SemiLight"/>
+                <w:sz w:val="28"/>
+                <w:szCs w:val="28"/>
+              </w:rPr>
+              <w:t>GitHub</w:t>
+            </w:r>
+          </w:p>
+        </w:tc>
+        <w:tc>
+          <w:tcPr>
+            <w:tcW w:w="3005" w:type="dxa"/>
+          </w:tcPr>
+          <w:p>
+            <w:pPr>
+              <w:jc w:val="center"/>
+              <w:rPr>
+                <w:rFonts w:ascii="Bahnschrift SemiLight" w:hAnsi="Bahnschrift SemiLight"/>
+                <w:sz w:val="28"/>
+                <w:szCs w:val="28"/>
+              </w:rPr>
+            </w:pPr>
+          </w:p>
+        </w:tc>
+        <w:tc>
+          <w:tcPr>
+            <w:tcW w:w="3006" w:type="dxa"/>
+          </w:tcPr>
+          <w:p>
+            <w:pPr>
+              <w:jc w:val="center"/>
+              <w:rPr>
+                <w:rFonts w:ascii="Bahnschrift SemiLight" w:hAnsi="Bahnschrift SemiLight"/>
+                <w:sz w:val="28"/>
+                <w:szCs w:val="28"/>
+              </w:rPr>
+            </w:pPr>
+          </w:p>
+        </w:tc>
+      </w:tr>
+      <w:tr>
+        <w:tc>
+          <w:tcPr>
+            <w:tcW w:w="3005" w:type="dxa"/>
+          </w:tcPr>
+          <w:p>
+            <w:pPr>
+              <w:jc w:val="center"/>
+              <w:rPr>
+                <w:rFonts w:ascii="Bahnschrift SemiLight" w:hAnsi="Bahnschrift SemiLight"/>
+                <w:sz w:val="28"/>
+                <w:szCs w:val="28"/>
+              </w:rPr>
+            </w:pPr>
+            <w:r>
+              <w:rPr>
+                <w:rFonts w:ascii="Bahnschrift SemiLight" w:hAnsi="Bahnschrift SemiLight"/>
+                <w:sz w:val="28"/>
+                <w:szCs w:val="28"/>
+              </w:rPr>
+              <w:t>Data pipeline diagram</w:t>
+            </w:r>
+          </w:p>
+        </w:tc>
+        <w:tc>
+          <w:tcPr>
+            <w:tcW w:w="3005" w:type="dxa"/>
+          </w:tcPr>
+          <w:p>
+            <w:pPr>
+              <w:jc w:val="center"/>
+              <w:rPr>
+                <w:rFonts w:ascii="Bahnschrift SemiLight" w:hAnsi="Bahnschrift SemiLight"/>
+                <w:sz w:val="28"/>
+                <w:szCs w:val="28"/>
+              </w:rPr>
+            </w:pPr>
+          </w:p>
+        </w:tc>
+        <w:tc>
+          <w:tcPr>
+            <w:tcW w:w="3006" w:type="dxa"/>
+          </w:tcPr>
+          <w:p>
+            <w:pPr>
+              <w:jc w:val="center"/>
+              <w:rPr>
+                <w:rFonts w:ascii="Bahnschrift SemiLight" w:hAnsi="Bahnschrift SemiLight"/>
+                <w:sz w:val="28"/>
+                <w:szCs w:val="28"/>
+              </w:rPr>
+            </w:pPr>
+          </w:p>
+        </w:tc>
+      </w:tr>
+      <w:tr>
+        <w:tc>
+          <w:tcPr>
+            <w:tcW w:w="3005" w:type="dxa"/>
+          </w:tcPr>
+          <w:p>
+            <w:pPr>
+              <w:jc w:val="center"/>
+              <w:rPr>
+                <w:rFonts w:ascii="Bahnschrift SemiLight" w:hAnsi="Bahnschrift SemiLight"/>
+                <w:sz w:val="28"/>
+                <w:szCs w:val="28"/>
+              </w:rPr>
+            </w:pPr>
+            <w:r>
+              <w:rPr>
+                <w:rFonts w:ascii="Bahnschrift SemiLight" w:hAnsi="Bahnschrift SemiLight"/>
+                <w:sz w:val="28"/>
+                <w:szCs w:val="28"/>
+              </w:rPr>
+              <w:t>Progress report</w:t>
+            </w:r>
+          </w:p>
+        </w:tc>
+        <w:tc>
+          <w:tcPr>
+            <w:tcW w:w="3005" w:type="dxa"/>
+          </w:tcPr>
+          <w:p>
+            <w:pPr>
+              <w:jc w:val="center"/>
+              <w:rPr>
+                <w:rFonts w:ascii="Bahnschrift SemiLight" w:hAnsi="Bahnschrift SemiLight"/>
+                <w:sz w:val="28"/>
+                <w:szCs w:val="28"/>
+              </w:rPr>
+            </w:pPr>
+          </w:p>
+        </w:tc>
+        <w:tc>
+          <w:tcPr>
+            <w:tcW w:w="3006" w:type="dxa"/>
+          </w:tcPr>
+          <w:p>
+            <w:pPr>
+              <w:jc w:val="center"/>
+              <w:rPr>
+                <w:rFonts w:ascii="Bahnschrift SemiLight" w:hAnsi="Bahnschrift SemiLight"/>
+                <w:sz w:val="28"/>
+                <w:szCs w:val="28"/>
+              </w:rPr>
+            </w:pPr>
+          </w:p>
+        </w:tc>
+      </w:tr>
+      <w:tr>
+        <w:tc>
+          <w:tcPr>
+            <w:tcW w:w="3005" w:type="dxa"/>
+          </w:tcPr>
+          <w:p>
+            <w:pPr>
+              <w:jc w:val="center"/>
+              <w:rPr>
+                <w:rFonts w:ascii="Bahnschrift SemiLight" w:hAnsi="Bahnschrift SemiLight"/>
+                <w:sz w:val="28"/>
+                <w:szCs w:val="28"/>
+              </w:rPr>
+            </w:pPr>
+            <w:r>
+              <w:rPr>
+                <w:rFonts w:ascii="Bahnschrift SemiLight" w:hAnsi="Bahnschrift SemiLight"/>
+                <w:sz w:val="28"/>
+                <w:szCs w:val="28"/>
+              </w:rPr>
+              <w:t>Contribution Statement</w:t>
+            </w:r>
+          </w:p>
+        </w:tc>
+        <w:tc>
+          <w:tcPr>
+            <w:tcW w:w="3005" w:type="dxa"/>
+          </w:tcPr>
+          <w:p>
+            <w:pPr>
+              <w:jc w:val="center"/>
+              <w:rPr>
+                <w:rFonts w:ascii="Bahnschrift SemiLight" w:hAnsi="Bahnschrift SemiLight"/>
+                <w:sz w:val="28"/>
+                <w:szCs w:val="28"/>
+              </w:rPr>
+            </w:pPr>
+          </w:p>
+        </w:tc>
+        <w:tc>
+          <w:tcPr>
+            <w:tcW w:w="3006" w:type="dxa"/>
+          </w:tcPr>
+          <w:p>
+            <w:pPr>
+              <w:jc w:val="center"/>
+              <w:rPr>
+                <w:rFonts w:ascii="Bahnschrift SemiLight" w:hAnsi="Bahnschrift SemiLight"/>
+                <w:sz w:val="28"/>
+                <w:szCs w:val="28"/>
+              </w:rPr>
+            </w:pPr>
+          </w:p>
+        </w:tc>
+      </w:tr>
+      <w:tr>
+        <w:tc>
+          <w:tcPr>
+            <w:tcW w:w="3005" w:type="dxa"/>
+          </w:tcPr>
+          <w:p>
+            <w:pPr>
+              <w:jc w:val="center"/>
+              <w:rPr>
+                <w:rFonts w:ascii="Bahnschrift SemiLight" w:hAnsi="Bahnschrift SemiLight"/>
+                <w:sz w:val="28"/>
+                <w:szCs w:val="28"/>
+              </w:rPr>
+            </w:pPr>
+            <w:r>
+              <w:rPr>
+                <w:rFonts w:ascii="Bahnschrift SemiLight" w:hAnsi="Bahnschrift SemiLight"/>
+                <w:sz w:val="28"/>
+                <w:szCs w:val="28"/>
+              </w:rPr>
+              <w:t>GitHub Repository Link .txt</w:t>
+            </w:r>
+          </w:p>
+        </w:tc>
+        <w:tc>
+          <w:tcPr>
+            <w:tcW w:w="3005" w:type="dxa"/>
+          </w:tcPr>
+          <w:p>
+            <w:pPr>
+              <w:jc w:val="center"/>
+              <w:rPr>
+                <w:rFonts w:ascii="Bahnschrift SemiLight" w:hAnsi="Bahnschrift SemiLight"/>
+                <w:sz w:val="28"/>
+                <w:szCs w:val="28"/>
+              </w:rPr>
+            </w:pPr>
+            <w:r>
+              <w:rPr>
+                <w:rFonts w:ascii="Bahnschrift SemiLight" w:hAnsi="Bahnschrift SemiLight"/>
+                <w:sz w:val="28"/>
+                <w:szCs w:val="28"/>
+              </w:rPr>
+              <w:t>100%</w:t>
+            </w:r>
+          </w:p>
+        </w:tc>
+        <w:tc>
+          <w:tcPr>
+            <w:tcW w:w="3006" w:type="dxa"/>
+          </w:tcPr>
+          <w:p>
+            <w:pPr>
+              <w:jc w:val="center"/>
+              <w:rPr>
+                <w:rFonts w:ascii="Bahnschrift SemiLight" w:hAnsi="Bahnschrift SemiLight"/>
+                <w:sz w:val="28"/>
+                <w:szCs w:val="28"/>
+              </w:rPr>
+            </w:pPr>
+            <w:r>
+              <w:rPr>
+                <w:rFonts w:ascii="Bahnschrift SemiLight" w:hAnsi="Bahnschrift SemiLight"/>
+                <w:sz w:val="28"/>
+                <w:szCs w:val="28"/>
+              </w:rPr>
+              <w:t>0%</w:t>
+            </w:r>
+          </w:p>
+        </w:tc>
+      </w:tr>
+    </w:tbl>
+    <w:p>
+      <w:pPr>
+        <w:rPr>
+          <w:rFonts w:ascii="Bahnschrift SemiLight" w:hAnsi="Bahnschrift SemiLight"/>
+          <w:sz w:val="28"/>
+          <w:szCs w:val="28"/>
+        </w:rPr>
+      </w:pPr>
+    </w:p>
+    <w:p>
+      <w:pPr>
+        <w:pStyle w:val="ListParagraph"/>
+        <w:numPr>
+          <w:ilvl w:val="0"/>
+          <w:numId w:val="1"/>
+        </w:numPr>
+        <w:rPr>
+          <w:rFonts w:ascii="Bahnschrift SemiLight" w:hAnsi="Bahnschrift SemiLight"/>
+          <w:sz w:val="28"/>
+          <w:szCs w:val="28"/>
+        </w:rPr>
+      </w:pPr>
+      <w:r>
+        <w:rPr>
+          <w:rFonts w:ascii="Bahnschrift SemiLight" w:hAnsi="Bahnschrift SemiLight"/>
+          <w:sz w:val="28"/>
+          <w:szCs w:val="28"/>
+        </w:rPr>
+        <w:t>* Taken at 30/08/2026 1:03am</w:t>
+      </w:r>
     </w:p>
     <w:p>
       <w:pPr>
@@ -81,6 +823,127 @@
     </w:sectPr>
   </w:body>
 </w:document>
+</file>
+
+<file path=word/numbering.xml><?xml version="1.0" encoding="utf-8"?>
+<w:numbering xmlns:wpc="http://schemas.microsoft.com/office/word/2010/wordprocessingCanvas" xmlns:cx="http://schemas.microsoft.com/office/drawing/2014/chartex" xmlns:cx1="http://schemas.microsoft.com/office/drawing/2015/9/8/chartex" xmlns:cx2="http://schemas.microsoft.com/office/drawing/2015/10/21/chartex" xmlns:cx3="http://schemas.microsoft.com/office/drawing/2016/5/9/chartex" xmlns:cx4="http://schemas.microsoft.com/office/drawing/2016/5/10/chartex" xmlns:cx5="http://schemas.microsoft.com/office/drawing/2016/5/11/chartex" xmlns:cx6="http://schemas.microsoft.com/office/drawing/2016/5/12/chartex" xmlns:cx7="http://schemas.microsoft.com/office/drawing/2016/5/13/chartex" xmlns:cx8="http://schemas.microsoft.com/office/drawing/2016/5/14/chartex" xmlns:mc="http://schemas.openxmlformats.org/markup-compatibility/2006" xmlns:aink="http://schemas.microsoft.com/office/drawing/2016/ink" xmlns:am3d="http://schemas.microsoft.com/office/drawing/2017/model3d" xmlns:o="urn:schemas-microsoft-com:office:office" xmlns:oel="http://schemas.microsoft.com/office/2019/extlst" xmlns:r="http://schemas.openxmlformats.org/officeDocument/2006/relationships" xmlns:m="http://schemas.openxmlformats.org/officeDocument/2006/math" xmlns:v="urn:schemas-microsoft-com:vml" xmlns:wp14="http://schemas.microsoft.com/office/word/2010/wordprocessingDrawing" xmlns:wp="http://schemas.openxmlformats.org/drawingml/2006/wordprocessingDrawing" xmlns:w10="urn:schemas-microsoft-com:office:word" xmlns:w="http://schemas.openxmlformats.org/wordprocessingml/2006/main" xmlns:w14="http://schemas.microsoft.com/office/word/2010/wordml" xmlns:w15="http://schemas.microsoft.com/office/word/2012/wordml" xmlns:w16cex="http://schemas.microsoft.com/office/word/2018/wordml/cex" xmlns:w16cid="http://schemas.microsoft.com/office/word/2016/wordml/cid" xmlns:w16="http://schemas.microsoft.com/office/word/2018/wordml" xmlns:w16du="http://schemas.microsoft.com/office/word/2023/wordml/word16du" xmlns:w16sdtdh="http://schemas.microsoft.com/office/word/2020/wordml/sdtdatahash" xmlns:w16sdtfl="http://schemas.microsoft.com/office/word/2024/wordml/sdtformatlock" xmlns:w16se="http://schemas.microsoft.com/office/word/2015/wordml/symex" xmlns:wpg="http://schemas.microsoft.com/office/word/2010/wordprocessingGroup" xmlns:wpi="http://schemas.microsoft.com/office/word/2010/wordprocessingInk" xmlns:wne="http://schemas.microsoft.com/office/word/2006/wordml" xmlns:wps="http://schemas.microsoft.com/office/word/2010/wordprocessingShape" mc:Ignorable="w14 w15 w16se w16cid w16 w16cex w16sdtdh w16sdtfl w16du wp14">
+  <w:abstractNum w:abstractNumId="0" w15:restartNumberingAfterBreak="0">
+    <w:nsid w:val="73F718DF"/>
+    <w:multiLevelType w:val="hybridMultilevel"/>
+    <w:tmpl w:val="26C6EA08"/>
+    <w:lvl w:ilvl="0" w:tplc="14090001">
+      <w:start w:val="1"/>
+      <w:numFmt w:val="bullet"/>
+      <w:lvlText w:val=""/>
+      <w:lvlJc w:val="left"/>
+      <w:pPr>
+        <w:ind w:left="720" w:hanging="360"/>
+      </w:pPr>
+      <w:rPr>
+        <w:rFonts w:ascii="Symbol" w:hAnsi="Symbol" w:hint="default"/>
+      </w:rPr>
+    </w:lvl>
+    <w:lvl w:ilvl="1" w:tplc="14090003" w:tentative="1">
+      <w:start w:val="1"/>
+      <w:numFmt w:val="bullet"/>
+      <w:lvlText w:val="o"/>
+      <w:lvlJc w:val="left"/>
+      <w:pPr>
+        <w:ind w:left="1440" w:hanging="360"/>
+      </w:pPr>
+      <w:rPr>
+        <w:rFonts w:ascii="Courier New" w:hAnsi="Courier New" w:cs="Courier New" w:hint="default"/>
+      </w:rPr>
+    </w:lvl>
+    <w:lvl w:ilvl="2" w:tplc="14090005" w:tentative="1">
+      <w:start w:val="1"/>
+      <w:numFmt w:val="bullet"/>
+      <w:lvlText w:val=""/>
+      <w:lvlJc w:val="left"/>
+      <w:pPr>
+        <w:ind w:left="2160" w:hanging="360"/>
+      </w:pPr>
+      <w:rPr>
+        <w:rFonts w:ascii="Wingdings" w:hAnsi="Wingdings" w:hint="default"/>
+      </w:rPr>
+    </w:lvl>
+    <w:lvl w:ilvl="3" w:tplc="14090001" w:tentative="1">
+      <w:start w:val="1"/>
+      <w:numFmt w:val="bullet"/>
+      <w:lvlText w:val=""/>
+      <w:lvlJc w:val="left"/>
+      <w:pPr>
+        <w:ind w:left="2880" w:hanging="360"/>
+      </w:pPr>
+      <w:rPr>
+        <w:rFonts w:ascii="Symbol" w:hAnsi="Symbol" w:hint="default"/>
+      </w:rPr>
+    </w:lvl>
+    <w:lvl w:ilvl="4" w:tplc="14090003" w:tentative="1">
+      <w:start w:val="1"/>
+      <w:numFmt w:val="bullet"/>
+      <w:lvlText w:val="o"/>
+      <w:lvlJc w:val="left"/>
+      <w:pPr>
+        <w:ind w:left="3600" w:hanging="360"/>
+      </w:pPr>
+      <w:rPr>
+        <w:rFonts w:ascii="Courier New" w:hAnsi="Courier New" w:cs="Courier New" w:hint="default"/>
+      </w:rPr>
+    </w:lvl>
+    <w:lvl w:ilvl="5" w:tplc="14090005" w:tentative="1">
+      <w:start w:val="1"/>
+      <w:numFmt w:val="bullet"/>
+      <w:lvlText w:val=""/>
+      <w:lvlJc w:val="left"/>
+      <w:pPr>
+        <w:ind w:left="4320" w:hanging="360"/>
+      </w:pPr>
+      <w:rPr>
+        <w:rFonts w:ascii="Wingdings" w:hAnsi="Wingdings" w:hint="default"/>
+      </w:rPr>
+    </w:lvl>
+    <w:lvl w:ilvl="6" w:tplc="14090001" w:tentative="1">
+      <w:start w:val="1"/>
+      <w:numFmt w:val="bullet"/>
+      <w:lvlText w:val=""/>
+      <w:lvlJc w:val="left"/>
+      <w:pPr>
+        <w:ind w:left="5040" w:hanging="360"/>
+      </w:pPr>
+      <w:rPr>
+        <w:rFonts w:ascii="Symbol" w:hAnsi="Symbol" w:hint="default"/>
+      </w:rPr>
+    </w:lvl>
+    <w:lvl w:ilvl="7" w:tplc="14090003" w:tentative="1">
+      <w:start w:val="1"/>
+      <w:numFmt w:val="bullet"/>
+      <w:lvlText w:val="o"/>
+      <w:lvlJc w:val="left"/>
+      <w:pPr>
+        <w:ind w:left="5760" w:hanging="360"/>
+      </w:pPr>
+      <w:rPr>
+        <w:rFonts w:ascii="Courier New" w:hAnsi="Courier New" w:cs="Courier New" w:hint="default"/>
+      </w:rPr>
+    </w:lvl>
+    <w:lvl w:ilvl="8" w:tplc="14090005" w:tentative="1">
+      <w:start w:val="1"/>
+      <w:numFmt w:val="bullet"/>
+      <w:lvlText w:val=""/>
+      <w:lvlJc w:val="left"/>
+      <w:pPr>
+        <w:ind w:left="6480" w:hanging="360"/>
+      </w:pPr>
+      <w:rPr>
+        <w:rFonts w:ascii="Wingdings" w:hAnsi="Wingdings" w:hint="default"/>
+      </w:rPr>
+    </w:lvl>
+  </w:abstractNum>
+  <w:num w:numId="1" w16cid:durableId="1243611425">
+    <w:abstractNumId w:val="0"/>
+  </w:num>
+</w:numbering>
 </file>
 
 <file path=word/styles.xml><?xml version="1.0" encoding="utf-8"?>
@@ -686,7 +1549,6 @@
   <w:style w:type="character" w:default="1" w:styleId="DefaultParagraphFont">
     <w:name w:val="Default Paragraph Font"/>
     <w:uiPriority w:val="1"/>
-    <w:semiHidden/>
     <w:unhideWhenUsed/>
   </w:style>
   <w:style w:type="table" w:default="1" w:styleId="TableNormal">
@@ -999,6 +1861,25 @@
       <w:color w:val="0F4761" w:themeColor="accent1" w:themeShade="BF"/>
       <w:spacing w:val="5"/>
     </w:rPr>
+  </w:style>
+  <w:style w:type="table" w:styleId="TableGrid">
+    <w:name w:val="Table Grid"/>
+    <w:basedOn w:val="TableNormal"/>
+    <w:uiPriority w:val="39"/>
+    <w:rsid w:val="003D3090"/>
+    <w:pPr>
+      <w:spacing w:after="0" w:line="240" w:lineRule="auto"/>
+    </w:pPr>
+    <w:tblPr>
+      <w:tblBorders>
+        <w:top w:val="single" w:sz="4" w:space="0" w:color="auto"/>
+        <w:left w:val="single" w:sz="4" w:space="0" w:color="auto"/>
+        <w:bottom w:val="single" w:sz="4" w:space="0" w:color="auto"/>
+        <w:right w:val="single" w:sz="4" w:space="0" w:color="auto"/>
+        <w:insideH w:val="single" w:sz="4" w:space="0" w:color="auto"/>
+        <w:insideV w:val="single" w:sz="4" w:space="0" w:color="auto"/>
+      </w:tblBorders>
+    </w:tblPr>
   </w:style>
 </w:styles>
 </file>

</xml_diff>

<commit_message>
Continuing analysis and working on report + contribution statement
</commit_message>
<xml_diff>
--- a/Low Battery Contribution Statement.docx
+++ b/Low Battery Contribution Statement.docx
@@ -307,15 +307,31 @@
                 <w:sz w:val="28"/>
                 <w:szCs w:val="28"/>
               </w:rPr>
-              <w:t>15</w:t>
-            </w:r>
-            <w:r>
-              <w:rPr>
-                <w:rFonts w:ascii="Bahnschrift SemiLight" w:hAnsi="Bahnschrift SemiLight"/>
-                <w:sz w:val="28"/>
-                <w:szCs w:val="28"/>
-              </w:rPr>
-              <w:t xml:space="preserve"> (78.9%)</w:t>
+              <w:t>18</w:t>
+            </w:r>
+            <w:r>
+              <w:rPr>
+                <w:rFonts w:ascii="Bahnschrift SemiLight" w:hAnsi="Bahnschrift SemiLight"/>
+                <w:sz w:val="28"/>
+                <w:szCs w:val="28"/>
+              </w:rPr>
+              <w:t xml:space="preserve"> (</w:t>
+            </w:r>
+            <w:r>
+              <w:rPr>
+                <w:rFonts w:ascii="Bahnschrift SemiLight" w:hAnsi="Bahnschrift SemiLight"/>
+                <w:sz w:val="28"/>
+                <w:szCs w:val="28"/>
+              </w:rPr>
+              <w:t>81.81</w:t>
+            </w:r>
+            <w:r>
+              <w:rPr>
+                <w:rFonts w:ascii="Bahnschrift SemiLight" w:hAnsi="Bahnschrift SemiLight"/>
+                <w:sz w:val="28"/>
+                <w:szCs w:val="28"/>
+              </w:rPr>
+              <w:t>%)</w:t>
             </w:r>
             <w:r>
               <w:rPr>
@@ -354,7 +370,23 @@
                 <w:sz w:val="28"/>
                 <w:szCs w:val="28"/>
               </w:rPr>
-              <w:t xml:space="preserve"> (21.1%)</w:t>
+              <w:t xml:space="preserve"> (</w:t>
+            </w:r>
+            <w:r>
+              <w:rPr>
+                <w:rFonts w:ascii="Bahnschrift SemiLight" w:hAnsi="Bahnschrift SemiLight"/>
+                <w:sz w:val="28"/>
+                <w:szCs w:val="28"/>
+              </w:rPr>
+              <w:t>18.19</w:t>
+            </w:r>
+            <w:r>
+              <w:rPr>
+                <w:rFonts w:ascii="Bahnschrift SemiLight" w:hAnsi="Bahnschrift SemiLight"/>
+                <w:sz w:val="28"/>
+                <w:szCs w:val="28"/>
+              </w:rPr>
+              <w:t>%)</w:t>
             </w:r>
             <w:r>
               <w:rPr>
@@ -750,7 +782,39 @@
           <w:sz w:val="28"/>
           <w:szCs w:val="28"/>
         </w:rPr>
-        <w:t>* Taken at 30/08/2026 1:03am</w:t>
+        <w:t xml:space="preserve">* Taken at 30/08/2026 </w:t>
+      </w:r>
+      <w:r>
+        <w:rPr>
+          <w:rFonts w:ascii="Bahnschrift SemiLight" w:hAnsi="Bahnschrift SemiLight"/>
+          <w:sz w:val="28"/>
+          <w:szCs w:val="28"/>
+        </w:rPr>
+        <w:t>4</w:t>
+      </w:r>
+      <w:r>
+        <w:rPr>
+          <w:rFonts w:ascii="Bahnschrift SemiLight" w:hAnsi="Bahnschrift SemiLight"/>
+          <w:sz w:val="28"/>
+          <w:szCs w:val="28"/>
+        </w:rPr>
+        <w:t>:</w:t>
+      </w:r>
+      <w:r>
+        <w:rPr>
+          <w:rFonts w:ascii="Bahnschrift SemiLight" w:hAnsi="Bahnschrift SemiLight"/>
+          <w:sz w:val="28"/>
+          <w:szCs w:val="28"/>
+        </w:rPr>
+        <w:t>45p</w:t>
+      </w:r>
+      <w:r>
+        <w:rPr>
+          <w:rFonts w:ascii="Bahnschrift SemiLight" w:hAnsi="Bahnschrift SemiLight"/>
+          <w:sz w:val="28"/>
+          <w:szCs w:val="28"/>
+        </w:rPr>
+        <w:t>m</w:t>
       </w:r>
     </w:p>
     <w:p>
@@ -1549,6 +1613,7 @@
   <w:style w:type="character" w:default="1" w:styleId="DefaultParagraphFont">
     <w:name w:val="Default Paragraph Font"/>
     <w:uiPriority w:val="1"/>
+    <w:semiHidden/>
     <w:unhideWhenUsed/>
   </w:style>
   <w:style w:type="table" w:default="1" w:styleId="TableNormal">

</xml_diff>